<commit_message>
Update CV publication summary
</commit_message>
<xml_diff>
--- a/pages/main-site/Lucas_Toshio_Ito_CV_2026.docx
+++ b/pages/main-site/Lucas_Toshio_Ito_CV_2026.docx
@@ -1137,7 +1137,7 @@
         <w:suppressAutoHyphens/>
       </w:pPr>
       <w:r>
-        <w:t>PUBLICATIONS</w:t>
+        <w:t>PUBLICATIONS (18 TOTAL; 2 FIRST‑AUTHOR)</w:t>
       </w:r>
     </w:p>
     <w:p>
@@ -1175,14 +1175,6 @@
         <w:suppressAutoHyphens/>
       </w:pPr>
       <w:r>
-        <w:rPr>
-          <w:color w:val="5E6875"/>
-          <w:sz w:val="16"/>
-        </w:rPr>
-        <w:t>1.</w:t>
-        <w:tab/>
-      </w:r>
-      <w:r>
         <w:t xml:space="preserve">Brañas MJA*, </w:t>
       </w:r>
       <w:r>
@@ -1202,14 +1194,6 @@
         <w:keepLines/>
         <w:suppressAutoHyphens/>
       </w:pPr>
-      <w:r>
-        <w:rPr>
-          <w:color w:val="5E6875"/>
-          <w:sz w:val="16"/>
-        </w:rPr>
-        <w:t>2.</w:t>
-        <w:tab/>
-      </w:r>
       <w:r>
         <w:t xml:space="preserve">Damiano RF, Low DM, </w:t>
       </w:r>
@@ -1231,14 +1215,6 @@
         <w:suppressAutoHyphens/>
       </w:pPr>
       <w:r>
-        <w:rPr>
-          <w:color w:val="5E6875"/>
-          <w:sz w:val="16"/>
-        </w:rPr>
-        <w:t>3.</w:t>
-        <w:tab/>
-      </w:r>
-      <w:r>
         <w:t xml:space="preserve">Legaz A, … </w:t>
       </w:r>
       <w:r>
@@ -1258,14 +1234,6 @@
         <w:keepLines/>
         <w:suppressAutoHyphens/>
       </w:pPr>
-      <w:r>
-        <w:rPr>
-          <w:color w:val="5E6875"/>
-          <w:sz w:val="16"/>
-        </w:rPr>
-        <w:t>4.</w:t>
-        <w:tab/>
-      </w:r>
       <w:r>
         <w:t xml:space="preserve">Fonseca L, </w:t>
       </w:r>
@@ -1287,14 +1255,6 @@
         <w:suppressAutoHyphens/>
       </w:pPr>
       <w:r>
-        <w:rPr>
-          <w:color w:val="5E6875"/>
-          <w:sz w:val="16"/>
-        </w:rPr>
-        <w:t>5.</w:t>
-        <w:tab/>
-      </w:r>
-      <w:r>
         <w:t xml:space="preserve">Cabrera‑Mendoza B, Panzenhagen AC, de Anda‑Jáuregui G, He J, Magalhaes PVS, Martínez‑Magaña JJ, Martínez‑Levy GA, Qiu D, Sotelo D, Torres D, Medrano JV, Vidal G, Velásquez MM, Nicolini H, Polimanti R, Kaster MP, Docherty AR, Kimbrel NA, Genis‑Mendoza AD, </w:t>
       </w:r>
       <w:r>
@@ -1314,14 +1274,6 @@
         <w:keepLines/>
         <w:suppressAutoHyphens/>
       </w:pPr>
-      <w:r>
-        <w:rPr>
-          <w:color w:val="5E6875"/>
-          <w:sz w:val="16"/>
-        </w:rPr>
-        <w:t>6.</w:t>
-        <w:tab/>
-      </w:r>
       <w:r>
         <w:t xml:space="preserve">Salum GA, Giusti C, Souza L, Juk J, Costa R, Sugaya L, Caye A, Simioni A, Rocha PB, Manfro GG, </w:t>
       </w:r>
@@ -1343,14 +1295,6 @@
         <w:suppressAutoHyphens/>
       </w:pPr>
       <w:r>
-        <w:rPr>
-          <w:color w:val="5E6875"/>
-          <w:sz w:val="16"/>
-        </w:rPr>
-        <w:t>7.</w:t>
-        <w:tab/>
-      </w:r>
-      <w:r>
         <w:t xml:space="preserve">Arendt JA, Zamariolli M, Almodobar L, </w:t>
       </w:r>
       <w:r>
@@ -1370,14 +1314,6 @@
         <w:keepLines/>
         <w:suppressAutoHyphens/>
       </w:pPr>
-      <w:r>
-        <w:rPr>
-          <w:color w:val="5E6875"/>
-          <w:sz w:val="16"/>
-        </w:rPr>
-        <w:t>8.</w:t>
-        <w:tab/>
-      </w:r>
       <w:r>
         <w:t xml:space="preserve">Doretto VF, Salto ABR, Schivoletto S, Zugman A, Oliveira MC, Brañas MJAA, Croci MS, </w:t>
       </w:r>
@@ -1399,14 +1335,6 @@
         <w:suppressAutoHyphens/>
       </w:pPr>
       <w:r>
-        <w:rPr>
-          <w:color w:val="5E6875"/>
-          <w:sz w:val="16"/>
-        </w:rPr>
-        <w:t>9.</w:t>
-        <w:tab/>
-      </w:r>
-      <w:r>
         <w:t xml:space="preserve">Duarte I, Hoffmann MS, Salum GA, Leffa DT, Belangero S, Santoro ML, Ota V, </w:t>
       </w:r>
       <w:r>
@@ -1427,14 +1355,6 @@
         <w:suppressAutoHyphens/>
       </w:pPr>
       <w:r>
-        <w:rPr>
-          <w:color w:val="5E6875"/>
-          <w:sz w:val="16"/>
-        </w:rPr>
-        <w:t>10.</w:t>
-        <w:tab/>
-      </w:r>
-      <w:r>
         <w:t xml:space="preserve">Salto ABR, Salum GA, Hoffmann MS, Santoro ML, Zugman A, Pan PM, Belangero SI, </w:t>
       </w:r>
       <w:r>
@@ -1454,14 +1374,6 @@
         <w:keepLines/>
         <w:suppressAutoHyphens/>
       </w:pPr>
-      <w:r>
-        <w:rPr>
-          <w:color w:val="5E6875"/>
-          <w:sz w:val="16"/>
-        </w:rPr>
-        <w:t>11.</w:t>
-        <w:tab/>
-      </w:r>
       <w:r>
         <w:t xml:space="preserve">Bandeira CE, Grevet EH, Vitola ES, Silva BS, Cupertino RB, Picon FA, </w:t>
       </w:r>
@@ -1484,14 +1396,6 @@
       </w:pPr>
       <w:r>
         <w:rPr>
-          <w:color w:val="5E6875"/>
-          <w:sz w:val="16"/>
-        </w:rPr>
-        <w:t>12.</w:t>
-        <w:tab/>
-      </w:r>
-      <w:r>
-        <w:rPr>
           <w:b/>
           <w:u w:val="single"/>
         </w:rPr>
@@ -1507,14 +1411,6 @@
         <w:keepLines/>
         <w:suppressAutoHyphens/>
       </w:pPr>
-      <w:r>
-        <w:rPr>
-          <w:color w:val="5E6875"/>
-          <w:sz w:val="16"/>
-        </w:rPr>
-        <w:t>13.</w:t>
-        <w:tab/>
-      </w:r>
       <w:r>
         <w:t xml:space="preserve">Honorato‑Mauer J, Xavier G, Ota VK, Chehimi SN, Mafra F, Cuóco C, </w:t>
       </w:r>
@@ -1551,14 +1447,6 @@
         <w:suppressAutoHyphens/>
       </w:pPr>
       <w:r>
-        <w:rPr>
-          <w:color w:val="5E6875"/>
-          <w:sz w:val="16"/>
-        </w:rPr>
-        <w:t>14.</w:t>
-        <w:tab/>
-      </w:r>
-      <w:r>
         <w:t xml:space="preserve">Colbert SMC, … </w:t>
       </w:r>
       <w:r>
@@ -1578,14 +1466,6 @@
         <w:keepLines/>
         <w:suppressAutoHyphens/>
       </w:pPr>
-      <w:r>
-        <w:rPr>
-          <w:color w:val="5E6875"/>
-          <w:sz w:val="16"/>
-        </w:rPr>
-        <w:t>15.</w:t>
-        <w:tab/>
-      </w:r>
       <w:r>
         <w:t xml:space="preserve">Engchuan W, Shanta O, … </w:t>
       </w:r>
@@ -1607,14 +1487,6 @@
         <w:suppressAutoHyphens/>
       </w:pPr>
       <w:r>
-        <w:rPr>
-          <w:color w:val="5E6875"/>
-          <w:sz w:val="16"/>
-        </w:rPr>
-        <w:t>16.</w:t>
-        <w:tab/>
-      </w:r>
-      <w:r>
         <w:t xml:space="preserve">Shanta O, Klein M, … </w:t>
       </w:r>
       <w:r>
@@ -1635,14 +1507,6 @@
         <w:suppressAutoHyphens/>
       </w:pPr>
       <w:r>
-        <w:rPr>
-          <w:color w:val="5E6875"/>
-          <w:sz w:val="16"/>
-        </w:rPr>
-        <w:t>17.</w:t>
-        <w:tab/>
-      </w:r>
-      <w:r>
         <w:t xml:space="preserve">Baltramonaityte V, … </w:t>
       </w:r>
       <w:r>
@@ -1662,14 +1526,6 @@
         <w:keepLines/>
         <w:suppressAutoHyphens/>
       </w:pPr>
-      <w:r>
-        <w:rPr>
-          <w:color w:val="5E6875"/>
-          <w:sz w:val="16"/>
-        </w:rPr>
-        <w:t>18.</w:t>
-        <w:tab/>
-      </w:r>
       <w:r>
         <w:t xml:space="preserve">Amaral JV, Jobim GS, Pacheco JPG, </w:t>
       </w:r>
@@ -14522,11 +14378,8 @@
   <w:style w:type="paragraph" w:customStyle="1" w:styleId="CVPublication">
     <w:name w:val="CV Publication"/>
     <w:pPr>
-      <w:tabs>
-        <w:tab w:pos="346" w:val="left"/>
-      </w:tabs>
       <w:spacing w:after="100" w:line="250" w:lineRule="auto"/>
-      <w:ind w:left="346" w:hanging="346"/>
+      <w:ind w:left="0" w:firstLine="0"/>
     </w:pPr>
     <w:rPr>
       <w:rFonts w:ascii="Arial" w:hAnsi="Arial"/>

</xml_diff>

<commit_message>
Publish CV with publication bullets
</commit_message>
<xml_diff>
--- a/pages/main-site/Lucas_Toshio_Ito_CV_2026.docx
+++ b/pages/main-site/Lucas_Toshio_Ito_CV_2026.docx
@@ -1175,6 +1175,14 @@
         <w:suppressAutoHyphens/>
       </w:pPr>
       <w:r>
+        <w:rPr>
+          <w:color w:val="5E6875"/>
+          <w:sz w:val="16"/>
+        </w:rPr>
+        <w:t>•</w:t>
+        <w:tab/>
+      </w:r>
+      <w:r>
         <w:t xml:space="preserve">Brañas MJA*, </w:t>
       </w:r>
       <w:r>
@@ -1194,6 +1202,14 @@
         <w:keepLines/>
         <w:suppressAutoHyphens/>
       </w:pPr>
+      <w:r>
+        <w:rPr>
+          <w:color w:val="5E6875"/>
+          <w:sz w:val="16"/>
+        </w:rPr>
+        <w:t>•</w:t>
+        <w:tab/>
+      </w:r>
       <w:r>
         <w:t xml:space="preserve">Damiano RF, Low DM, </w:t>
       </w:r>
@@ -1215,6 +1231,14 @@
         <w:suppressAutoHyphens/>
       </w:pPr>
       <w:r>
+        <w:rPr>
+          <w:color w:val="5E6875"/>
+          <w:sz w:val="16"/>
+        </w:rPr>
+        <w:t>•</w:t>
+        <w:tab/>
+      </w:r>
+      <w:r>
         <w:t xml:space="preserve">Legaz A, … </w:t>
       </w:r>
       <w:r>
@@ -1234,6 +1258,14 @@
         <w:keepLines/>
         <w:suppressAutoHyphens/>
       </w:pPr>
+      <w:r>
+        <w:rPr>
+          <w:color w:val="5E6875"/>
+          <w:sz w:val="16"/>
+        </w:rPr>
+        <w:t>•</w:t>
+        <w:tab/>
+      </w:r>
       <w:r>
         <w:t xml:space="preserve">Fonseca L, </w:t>
       </w:r>
@@ -1255,6 +1287,14 @@
         <w:suppressAutoHyphens/>
       </w:pPr>
       <w:r>
+        <w:rPr>
+          <w:color w:val="5E6875"/>
+          <w:sz w:val="16"/>
+        </w:rPr>
+        <w:t>•</w:t>
+        <w:tab/>
+      </w:r>
+      <w:r>
         <w:t xml:space="preserve">Cabrera‑Mendoza B, Panzenhagen AC, de Anda‑Jáuregui G, He J, Magalhaes PVS, Martínez‑Magaña JJ, Martínez‑Levy GA, Qiu D, Sotelo D, Torres D, Medrano JV, Vidal G, Velásquez MM, Nicolini H, Polimanti R, Kaster MP, Docherty AR, Kimbrel NA, Genis‑Mendoza AD, </w:t>
       </w:r>
       <w:r>
@@ -1274,6 +1314,14 @@
         <w:keepLines/>
         <w:suppressAutoHyphens/>
       </w:pPr>
+      <w:r>
+        <w:rPr>
+          <w:color w:val="5E6875"/>
+          <w:sz w:val="16"/>
+        </w:rPr>
+        <w:t>•</w:t>
+        <w:tab/>
+      </w:r>
       <w:r>
         <w:t xml:space="preserve">Salum GA, Giusti C, Souza L, Juk J, Costa R, Sugaya L, Caye A, Simioni A, Rocha PB, Manfro GG, </w:t>
       </w:r>
@@ -1295,6 +1343,14 @@
         <w:suppressAutoHyphens/>
       </w:pPr>
       <w:r>
+        <w:rPr>
+          <w:color w:val="5E6875"/>
+          <w:sz w:val="16"/>
+        </w:rPr>
+        <w:t>•</w:t>
+        <w:tab/>
+      </w:r>
+      <w:r>
         <w:t xml:space="preserve">Arendt JA, Zamariolli M, Almodobar L, </w:t>
       </w:r>
       <w:r>
@@ -1314,6 +1370,14 @@
         <w:keepLines/>
         <w:suppressAutoHyphens/>
       </w:pPr>
+      <w:r>
+        <w:rPr>
+          <w:color w:val="5E6875"/>
+          <w:sz w:val="16"/>
+        </w:rPr>
+        <w:t>•</w:t>
+        <w:tab/>
+      </w:r>
       <w:r>
         <w:t xml:space="preserve">Doretto VF, Salto ABR, Schivoletto S, Zugman A, Oliveira MC, Brañas MJAA, Croci MS, </w:t>
       </w:r>
@@ -1335,6 +1399,14 @@
         <w:suppressAutoHyphens/>
       </w:pPr>
       <w:r>
+        <w:rPr>
+          <w:color w:val="5E6875"/>
+          <w:sz w:val="16"/>
+        </w:rPr>
+        <w:t>•</w:t>
+        <w:tab/>
+      </w:r>
+      <w:r>
         <w:t xml:space="preserve">Duarte I, Hoffmann MS, Salum GA, Leffa DT, Belangero S, Santoro ML, Ota V, </w:t>
       </w:r>
       <w:r>
@@ -1355,6 +1427,14 @@
         <w:suppressAutoHyphens/>
       </w:pPr>
       <w:r>
+        <w:rPr>
+          <w:color w:val="5E6875"/>
+          <w:sz w:val="16"/>
+        </w:rPr>
+        <w:t>•</w:t>
+        <w:tab/>
+      </w:r>
+      <w:r>
         <w:t xml:space="preserve">Salto ABR, Salum GA, Hoffmann MS, Santoro ML, Zugman A, Pan PM, Belangero SI, </w:t>
       </w:r>
       <w:r>
@@ -1374,6 +1454,14 @@
         <w:keepLines/>
         <w:suppressAutoHyphens/>
       </w:pPr>
+      <w:r>
+        <w:rPr>
+          <w:color w:val="5E6875"/>
+          <w:sz w:val="16"/>
+        </w:rPr>
+        <w:t>•</w:t>
+        <w:tab/>
+      </w:r>
       <w:r>
         <w:t xml:space="preserve">Bandeira CE, Grevet EH, Vitola ES, Silva BS, Cupertino RB, Picon FA, </w:t>
       </w:r>
@@ -1396,6 +1484,14 @@
       </w:pPr>
       <w:r>
         <w:rPr>
+          <w:color w:val="5E6875"/>
+          <w:sz w:val="16"/>
+        </w:rPr>
+        <w:t>•</w:t>
+        <w:tab/>
+      </w:r>
+      <w:r>
+        <w:rPr>
           <w:b/>
           <w:u w:val="single"/>
         </w:rPr>
@@ -1411,6 +1507,14 @@
         <w:keepLines/>
         <w:suppressAutoHyphens/>
       </w:pPr>
+      <w:r>
+        <w:rPr>
+          <w:color w:val="5E6875"/>
+          <w:sz w:val="16"/>
+        </w:rPr>
+        <w:t>•</w:t>
+        <w:tab/>
+      </w:r>
       <w:r>
         <w:t xml:space="preserve">Honorato‑Mauer J, Xavier G, Ota VK, Chehimi SN, Mafra F, Cuóco C, </w:t>
       </w:r>
@@ -1447,6 +1551,14 @@
         <w:suppressAutoHyphens/>
       </w:pPr>
       <w:r>
+        <w:rPr>
+          <w:color w:val="5E6875"/>
+          <w:sz w:val="16"/>
+        </w:rPr>
+        <w:t>•</w:t>
+        <w:tab/>
+      </w:r>
+      <w:r>
         <w:t xml:space="preserve">Colbert SMC, … </w:t>
       </w:r>
       <w:r>
@@ -1466,6 +1578,14 @@
         <w:keepLines/>
         <w:suppressAutoHyphens/>
       </w:pPr>
+      <w:r>
+        <w:rPr>
+          <w:color w:val="5E6875"/>
+          <w:sz w:val="16"/>
+        </w:rPr>
+        <w:t>•</w:t>
+        <w:tab/>
+      </w:r>
       <w:r>
         <w:t xml:space="preserve">Engchuan W, Shanta O, … </w:t>
       </w:r>
@@ -1487,6 +1607,14 @@
         <w:suppressAutoHyphens/>
       </w:pPr>
       <w:r>
+        <w:rPr>
+          <w:color w:val="5E6875"/>
+          <w:sz w:val="16"/>
+        </w:rPr>
+        <w:t>•</w:t>
+        <w:tab/>
+      </w:r>
+      <w:r>
         <w:t xml:space="preserve">Shanta O, Klein M, … </w:t>
       </w:r>
       <w:r>
@@ -1507,6 +1635,14 @@
         <w:suppressAutoHyphens/>
       </w:pPr>
       <w:r>
+        <w:rPr>
+          <w:color w:val="5E6875"/>
+          <w:sz w:val="16"/>
+        </w:rPr>
+        <w:t>•</w:t>
+        <w:tab/>
+      </w:r>
+      <w:r>
         <w:t xml:space="preserve">Baltramonaityte V, … </w:t>
       </w:r>
       <w:r>
@@ -1526,6 +1662,14 @@
         <w:keepLines/>
         <w:suppressAutoHyphens/>
       </w:pPr>
+      <w:r>
+        <w:rPr>
+          <w:color w:val="5E6875"/>
+          <w:sz w:val="16"/>
+        </w:rPr>
+        <w:t>•</w:t>
+        <w:tab/>
+      </w:r>
       <w:r>
         <w:t xml:space="preserve">Amaral JV, Jobim GS, Pacheco JPG, </w:t>
       </w:r>
@@ -14378,8 +14522,11 @@
   <w:style w:type="paragraph" w:customStyle="1" w:styleId="CVPublication">
     <w:name w:val="CV Publication"/>
     <w:pPr>
+      <w:tabs>
+        <w:tab w:pos="346" w:val="left"/>
+      </w:tabs>
       <w:spacing w:after="100" w:line="250" w:lineRule="auto"/>
-      <w:ind w:left="0" w:firstLine="0"/>
+      <w:ind w:left="346" w:hanging="346"/>
     </w:pPr>
     <w:rPr>
       <w:rFonts w:ascii="Arial" w:hAnsi="Arial"/>

</xml_diff>